<commit_message>
Se arreglan errores del archivo
</commit_message>
<xml_diff>
--- a/momento_1/Proyecto Final.docx
+++ b/momento_1/Proyecto Final.docx
@@ -124,7 +124,7 @@
           <w:sz w:val="22"/>
           <w:szCs w:val="22"/>
         </w:rPr>
-        <w:t xml:space="preserve"> Joan Esteban Betancur Cadavid, [Nombre del compañero]</w:t>
+        <w:t xml:space="preserve"> Joan Esteban Betancur Cadavid</w:t>
       </w:r>
     </w:p>
     <w:p>
@@ -274,49 +274,7 @@
           <w:sz w:val="22"/>
           <w:szCs w:val="22"/>
         </w:rPr>
-        <w:t xml:space="preserve"> El malware se infiltra en el kernel o centro de procesamiento. El SO entra en alerta máxima. Si el malware sobrevive a un tiempo determinado de escaneo (</w:t>
-      </w:r>
-      <w:r>
-        <w:rPr>
-          <w:sz w:val="22"/>
-          <w:szCs w:val="22"/>
-        </w:rPr>
-        <w:t>durante este tiempo va a tener que esquivar obstáculos</w:t>
-      </w:r>
-      <w:r>
-        <w:rPr>
-          <w:sz w:val="22"/>
-          <w:szCs w:val="22"/>
-        </w:rPr>
-        <w:t xml:space="preserve">: </w:t>
-      </w:r>
-      <w:r>
-        <w:rPr>
-          <w:sz w:val="22"/>
-          <w:szCs w:val="22"/>
-        </w:rPr>
-        <w:t>paquetes de limpieza)</w:t>
-      </w:r>
-      <w:r>
-        <w:rPr>
-          <w:sz w:val="22"/>
-          <w:szCs w:val="22"/>
-        </w:rPr>
-        <w:t>,</w:t>
-      </w:r>
-      <w:r>
-        <w:rPr>
-          <w:sz w:val="22"/>
-          <w:szCs w:val="22"/>
-        </w:rPr>
-        <w:t xml:space="preserve"> </w:t>
-      </w:r>
-      <w:r>
-        <w:rPr>
-          <w:sz w:val="22"/>
-          <w:szCs w:val="22"/>
-        </w:rPr>
-        <w:t>va a lograr inyectar su carga, y destruir todo el sistema (Victoria). Este nivel es en vista cenital. Las físicas básicas a tener en cuenta para este nivel son: Colisiones elásticas</w:t>
+        <w:t xml:space="preserve"> El malware se infiltra en el kernel o centro de procesamiento. El SO entra en alerta máxima. Si el malware sobrevive a un tiempo determinado de escaneo (durante este tiempo va a tener que esquivar obstáculos: paquetes de limpieza), va a lograr inyectar su carga, y destruir todo el sistema (Victoria). Este nivel es en vista cenital. Las físicas básicas a tener en cuenta para este nivel son: Colisiones elásticas</w:t>
       </w:r>
       <w:r>
         <w:rPr>
@@ -490,23 +448,7 @@
           <w:sz w:val="22"/>
           <w:szCs w:val="22"/>
         </w:rPr>
-        <w:t xml:space="preserve">Monitorea las coordenadas en X y </w:t>
-      </w:r>
-      <w:proofErr w:type="spellStart"/>
-      <w:r>
-        <w:rPr>
-          <w:sz w:val="22"/>
-          <w:szCs w:val="22"/>
-        </w:rPr>
-        <w:t>Y</w:t>
-      </w:r>
-      <w:proofErr w:type="spellEnd"/>
-      <w:r>
-        <w:rPr>
-          <w:sz w:val="22"/>
-          <w:szCs w:val="22"/>
-        </w:rPr>
-        <w:t xml:space="preserve"> del malware (jugador).</w:t>
+        <w:t>Monitorea las coordenadas en X y Y del malware (jugador).</w:t>
       </w:r>
     </w:p>
     <w:p>
@@ -606,23 +548,7 @@
           <w:sz w:val="22"/>
           <w:szCs w:val="22"/>
         </w:rPr>
-        <w:t xml:space="preserve">El agente almacena los errores del jugador para atacar </w:t>
-      </w:r>
-      <w:proofErr w:type="spellStart"/>
-      <w:r>
-        <w:rPr>
-          <w:sz w:val="22"/>
-          <w:szCs w:val="22"/>
-        </w:rPr>
-        <w:t>mas</w:t>
-      </w:r>
-      <w:proofErr w:type="spellEnd"/>
-      <w:r>
-        <w:rPr>
-          <w:sz w:val="22"/>
-          <w:szCs w:val="22"/>
-        </w:rPr>
-        <w:t xml:space="preserve"> por esas zonas.</w:t>
+        <w:t>El agente almacena los errores del jugador para atacar mas por esas zonas.</w:t>
       </w:r>
     </w:p>
     <w:p/>

</xml_diff>